<commit_message>
Update OutSystems certification count to 11 (verified from profile)
Confirmed against the public OutSystems credential page: 6
certifications (Expert Developer, Professional Web Developer,
Professional Traditional Web Developer, Associate Developer on both
OutSystems 11 and ODC, Associate Traditional Web Developer) plus 5
specializations (Architecture, Security, Front-end Developer, Mobile
Developer, Web Developer). Updates both the site and the CV.
</commit_message>
<xml_diff>
--- a/Jonas_Fiers_CV.docx
+++ b/Jonas_Fiers_CV.docx
@@ -613,16 +613,41 @@
           <w:sz w:val="19"/>
           <w:szCs w:val="19"/>
         </w:rPr>
-        <w:t xml:space="preserve">OutSystems certifications (10): </w:t>
-      </w:r>
-      <w:r>
-        <w:rPr>
-          <w:rFonts w:ascii="Arial" w:cs="Arial" w:eastAsia="Arial" w:hAnsi="Arial"/>
-          <w:color w:val="1A1A1A"/>
-          <w:sz w:val="19"/>
-          <w:szCs w:val="19"/>
-        </w:rPr>
-        <w:t xml:space="preserve">Expert Developer, Architecture Specialist, Security Specialist, Front-end Developer Specialist, Mobile Developer Specialist, Web Developer Specialist, plus Associate-level certifications —</w:t>
+        <w:t xml:space="preserve">OutSystems certifications &amp; specializations (11) — Certifications (6): </w:t>
+      </w:r>
+      <w:r>
+        <w:rPr>
+          <w:rFonts w:ascii="Arial" w:cs="Arial" w:eastAsia="Arial" w:hAnsi="Arial"/>
+          <w:color w:val="1A1A1A"/>
+          <w:sz w:val="19"/>
+          <w:szCs w:val="19"/>
+        </w:rPr>
+        <w:t xml:space="preserve">Expert Developer, Professional Web Developer, Professional Traditional Web Developer, Associate Developer (OutSystems 11 &amp; ODC), Associate Traditional Web Developer</w:t>
+      </w:r>
+    </w:p>
+    <w:p>
+      <w:pPr>
+        <w:spacing w:after="60"/>
+      </w:pPr>
+      <w:r>
+        <w:rPr>
+          <w:rFonts w:ascii="Arial" w:cs="Arial" w:eastAsia="Arial" w:hAnsi="Arial"/>
+          <w:b/>
+          <w:bCs/>
+          <w:color w:val="1A1A1A"/>
+          <w:sz w:val="19"/>
+          <w:szCs w:val="19"/>
+        </w:rPr>
+        <w:t xml:space="preserve">Specializations (5): </w:t>
+      </w:r>
+      <w:r>
+        <w:rPr>
+          <w:rFonts w:ascii="Arial" w:cs="Arial" w:eastAsia="Arial" w:hAnsi="Arial"/>
+          <w:color w:val="1A1A1A"/>
+          <w:sz w:val="19"/>
+          <w:szCs w:val="19"/>
+        </w:rPr>
+        <w:t xml:space="preserve">Architecture, Security, Front-end Developer, Mobile Developer, Web Developer —</w:t>
       </w:r>
     </w:p>
     <w:p>
@@ -638,7 +663,7 @@
         </w:rPr>
         <w:t xml:space="preserve"/>
       </w:r>
-      <w:hyperlink w:history="1" r:id="rIdrooqdxlh9mdbpk_cp7vgh">
+      <w:hyperlink w:history="1" r:id="rIddtpb8817u_00ajjdodu-w">
         <w:r>
           <w:rPr>
             <w:rFonts w:ascii="Arial" w:cs="Arial" w:eastAsia="Arial" w:hAnsi="Arial"/>
@@ -734,7 +759,7 @@
         </w:rPr>
         <w:t xml:space="preserve"/>
       </w:r>
-      <w:hyperlink w:history="1" r:id="rId0dl4h27bru8275hafcpjn">
+      <w:hyperlink w:history="1" r:id="rId1figxnfcffcd1clwxa9ht">
         <w:r>
           <w:rPr>
             <w:rFonts w:ascii="Arial" w:cs="Arial" w:eastAsia="Arial" w:hAnsi="Arial"/>
@@ -785,7 +810,7 @@
         </w:rPr>
         <w:t xml:space="preserve"/>
       </w:r>
-      <w:hyperlink w:history="1" r:id="rIdmjjcbwxifbsttmr9coxx1">
+      <w:hyperlink w:history="1" r:id="rIdj5ap4q3y6rzbhktti1t4b">
         <w:r>
           <w:rPr>
             <w:rFonts w:ascii="Arial" w:cs="Arial" w:eastAsia="Arial" w:hAnsi="Arial"/>
@@ -834,7 +859,7 @@
     </w:p>
     <w:sectPr>
       <w:pgSz w:w="11906" w:h="16838" w:orient="portrait"/>
-      <w:pgMar w:top="560" w:right="900" w:bottom="560" w:left="900" w:header="708" w:footer="708" w:gutter="0"/>
+      <w:pgMar w:top="460" w:right="900" w:bottom="460" w:left="900" w:header="708" w:footer="708" w:gutter="0"/>
       <w:pgNumType/>
       <w:docGrid w:linePitch="360"/>
     </w:sectPr>

</xml_diff>

<commit_message>
Regroup OutSystems certifications by tier and architecture variant
Expert Developer, Professional Developer (Reactive & Traditional),
Associate Developer (ODC, Reactive & Traditional) — clearer than
listing each raw badge title separately. Same 6 certifications, better
grouping. Updates both the site and the CV.
</commit_message>
<xml_diff>
--- a/Jonas_Fiers_CV.docx
+++ b/Jonas_Fiers_CV.docx
@@ -622,7 +622,7 @@
           <w:sz w:val="19"/>
           <w:szCs w:val="19"/>
         </w:rPr>
-        <w:t xml:space="preserve">Expert Developer, Professional Web Developer, Professional Traditional Web Developer, Associate Developer (OutSystems 11 &amp; ODC), Associate Traditional Web Developer</w:t>
+        <w:t xml:space="preserve">Expert Developer, Professional Developer (Reactive &amp; Traditional), Associate Developer (ODC, Reactive &amp; Traditional)</w:t>
       </w:r>
     </w:p>
     <w:p>
@@ -663,7 +663,7 @@
         </w:rPr>
         <w:t xml:space="preserve"/>
       </w:r>
-      <w:hyperlink w:history="1" r:id="rIddtpb8817u_00ajjdodu-w">
+      <w:hyperlink w:history="1" r:id="rIdvxduq0dy_fk3qenitnfch">
         <w:r>
           <w:rPr>
             <w:rFonts w:ascii="Arial" w:cs="Arial" w:eastAsia="Arial" w:hAnsi="Arial"/>
@@ -759,7 +759,7 @@
         </w:rPr>
         <w:t xml:space="preserve"/>
       </w:r>
-      <w:hyperlink w:history="1" r:id="rId1figxnfcffcd1clwxa9ht">
+      <w:hyperlink w:history="1" r:id="rIddk6jjljp86jfdsv-03oba">
         <w:r>
           <w:rPr>
             <w:rFonts w:ascii="Arial" w:cs="Arial" w:eastAsia="Arial" w:hAnsi="Arial"/>
@@ -810,7 +810,7 @@
         </w:rPr>
         <w:t xml:space="preserve"/>
       </w:r>
-      <w:hyperlink w:history="1" r:id="rIdj5ap4q3y6rzbhktti1t4b">
+      <w:hyperlink w:history="1" r:id="rIdw7tmmarkanq5z4vgymqhn">
         <w:r>
           <w:rPr>
             <w:rFonts w:ascii="Arial" w:cs="Arial" w:eastAsia="Arial" w:hAnsi="Arial"/>

</xml_diff>

<commit_message>
cv: sync with the portfolio page
Soften the traceability story to the site's wording (drop the named
2022 crisis), add PICASSO to personal projects, and condense each
project to a single line with its link inline. Still a one-pager at
the original spacing.

Co-Authored-By: Claude Fable 5 <noreply@anthropic.com>
</commit_message>
<xml_diff>
--- a/Jonas_Fiers_CV.docx
+++ b/Jonas_Fiers_CV.docx
@@ -43,43 +43,7 @@
           <w:sz w:val="18"/>
           <w:szCs w:val="18"/>
         </w:rPr>
-        <w:t xml:space="preserve">hello@jonasfiers.eu | </w:t>
-      </w:r>
-      <w:r>
-        <w:rPr>
-          <w:rFonts w:ascii="Arial" w:cs="Arial" w:eastAsia="Arial" w:hAnsi="Arial"/>
-          <w:color w:val="595959"/>
-          <w:sz w:val="18"/>
-          <w:szCs w:val="18"/>
-        </w:rPr>
-        <w:t xml:space="preserve">linkedin.com/in/jonasfiers</w:t>
-      </w:r>
-      <w:r>
-        <w:rPr>
-          <w:rFonts w:ascii="Arial" w:cs="Arial" w:eastAsia="Arial" w:hAnsi="Arial"/>
-          <w:color w:val="595959"/>
-          <w:sz w:val="18"/>
-          <w:szCs w:val="18"/>
-        </w:rPr>
-        <w:t xml:space="preserve"> | </w:t>
-      </w:r>
-      <w:r>
-        <w:rPr>
-          <w:rFonts w:ascii="Arial" w:cs="Arial" w:eastAsia="Arial" w:hAnsi="Arial"/>
-          <w:color w:val="595959"/>
-          <w:sz w:val="18"/>
-          <w:szCs w:val="18"/>
-        </w:rPr>
-        <w:t xml:space="preserve">github.com/jonasfiers</w:t>
-      </w:r>
-      <w:r>
-        <w:rPr>
-          <w:rFonts w:ascii="Arial" w:cs="Arial" w:eastAsia="Arial" w:hAnsi="Arial"/>
-          <w:color w:val="595959"/>
-          <w:sz w:val="18"/>
-          <w:szCs w:val="18"/>
-        </w:rPr>
-        <w:t xml:space="preserve"> | Ghent, Belgium</w:t>
+        <w:t xml:space="preserve">hello@jonasfiers.eu | linkedin.com/in/jonasfiers | github.com/jonasfiers | Ghent, Belgium</w:t>
       </w:r>
     </w:p>
     <w:p>
@@ -343,7 +307,7 @@
           <w:sz w:val="19"/>
           <w:szCs w:val="19"/>
         </w:rPr>
-        <w:t xml:space="preserve">: built in OutSystems with a Neo4j graph engine underneath for international traceability reporting, unblocking a 10-year bottleneck right as the 2022 chocolate-industry salmonella crisis hit. Kept the production line running with zero downtime while the affected competitor was shut down for 6 weeks — saving the company millions, with insurance savings still rolling in.</w:t>
+        <w:t xml:space="preserve">: built in OutSystems with a Neo4j graph engine underneath for international traceability reporting, unblocking a 10-year bottleneck right as a major food-safety crisis made it urgent. Kept the production line running with zero downtime while a competitor caught in the same crisis was shut down for 6 weeks — saving the company millions, with insurance savings still rolling in.</w:t>
       </w:r>
     </w:p>
     <w:p>
@@ -479,18 +443,7 @@
           <w:sz w:val="18"/>
           <w:szCs w:val="18"/>
         </w:rPr>
-        <w:t xml:space="preserve">Earlier experience: </w:t>
-      </w:r>
-      <w:r>
-        <w:rPr>
-          <w:rFonts w:ascii="Arial" w:cs="Arial" w:eastAsia="Arial" w:hAnsi="Arial"/>
-          <w:i/>
-          <w:iCs/>
-          <w:color w:val="595959"/>
-          <w:sz w:val="18"/>
-          <w:szCs w:val="18"/>
-        </w:rPr>
-        <w:t xml:space="preserve">Server, Coeur d'Artichaut (2015–2016); Server, Oude Vismijn (2012–2015) — both in Ghent, Belgium.</w:t>
+        <w:t xml:space="preserve">Earlier experience: Server, Coeur d'Artichaut (2015–2016); Server, Oude Vismijn (2012–2015) — both in Ghent, Belgium.</w:t>
       </w:r>
     </w:p>
     <w:p>
@@ -723,7 +676,7 @@
     </w:p>
     <w:p>
       <w:pPr>
-        <w:spacing w:after="30"/>
+        <w:spacing w:after="45"/>
       </w:pPr>
       <w:r>
         <w:rPr>
@@ -743,21 +696,7 @@
           <w:sz w:val="19"/>
           <w:szCs w:val="19"/>
         </w:rPr>
-        <w:t xml:space="preserve"> — a self-hosted, Splitwise-style expense-splitting app built to explore graph data modeling in Neo4j, with a Node.js/React stack. </w:t>
-      </w:r>
-    </w:p>
-    <w:p>
-      <w:pPr>
-        <w:spacing w:after="100"/>
-      </w:pPr>
-      <w:r>
-        <w:rPr>
-          <w:rFonts w:ascii="Arial" w:cs="Arial" w:eastAsia="Arial" w:hAnsi="Arial"/>
-          <w:color w:val="1A1A1A"/>
-          <w:sz w:val="19"/>
-          <w:szCs w:val="19"/>
-        </w:rPr>
-        <w:t xml:space="preserve"/>
+        <w:t xml:space="preserve"> — Splitwise-style expense splitter built to explore Neo4j graph modeling — </w:t>
       </w:r>
       <w:hyperlink w:history="1" r:id="rIddk6jjljp86jfdsv-03oba">
         <w:r>
@@ -774,7 +713,7 @@
     </w:p>
     <w:p>
       <w:pPr>
-        <w:spacing w:after="30"/>
+        <w:spacing w:after="45"/>
       </w:pPr>
       <w:r>
         <w:rPr>
@@ -794,21 +733,7 @@
           <w:sz w:val="19"/>
           <w:szCs w:val="19"/>
         </w:rPr>
-        <w:t xml:space="preserve"> — a companion project reimagining Splitty's live graph balance as a 1970s-style COBOL batch system: transactions are aggregated overnight into a flat file instead of computed live. </w:t>
-      </w:r>
-    </w:p>
-    <w:p>
-      <w:pPr>
-        <w:spacing w:after="100"/>
-      </w:pPr>
-      <w:r>
-        <w:rPr>
-          <w:rFonts w:ascii="Arial" w:cs="Arial" w:eastAsia="Arial" w:hAnsi="Arial"/>
-          <w:color w:val="1A1A1A"/>
-          <w:sz w:val="19"/>
-          <w:szCs w:val="19"/>
-        </w:rPr>
-        <w:t xml:space="preserve"/>
+        <w:t xml:space="preserve"> — Splitty reimagined as a 1970s COBOL nightly-batch system — </w:t>
       </w:r>
       <w:hyperlink w:history="1" r:id="rIdw7tmmarkanq5z4vgymqhn">
         <w:r>
@@ -820,6 +745,43 @@
             <w:u w:val="single"/>
           </w:rPr>
           <w:t xml:space="preserve">catalog74.jonasfiers.eu</w:t>
+        </w:r>
+      </w:hyperlink>
+    </w:p>
+    <w:p>
+      <w:pPr>
+        <w:spacing w:after="100"/>
+      </w:pPr>
+      <w:r>
+        <w:rPr>
+          <w:rFonts w:ascii="Arial" w:cs="Arial" w:eastAsia="Arial" w:hAnsi="Arial"/>
+          <w:b/>
+          <w:bCs/>
+          <w:color w:val="1A1A1A"/>
+          <w:sz w:val="19"/>
+          <w:szCs w:val="19"/>
+        </w:rPr>
+        <w:t xml:space="preserve">PICASSO</w:t>
+      </w:r>
+      <w:r>
+        <w:rPr>
+          <w:rFonts w:ascii="Arial" w:cs="Arial" w:eastAsia="Arial" w:hAnsi="Arial"/>
+          <w:color w:val="1A1A1A"/>
+          <w:sz w:val="19"/>
+          <w:szCs w:val="19"/>
+        </w:rPr>
+        <w:t xml:space="preserve"> (WIP) — .NET COBOL copybook parser for OutSystems — </w:t>
+      </w:r>
+      <w:hyperlink w:history="1" r:id="rIdpicassogithub">
+        <w:r>
+          <w:rPr>
+            <w:rFonts w:ascii="Arial" w:cs="Arial" w:eastAsia="Arial" w:hAnsi="Arial"/>
+            <w:color w:val="7A8A22"/>
+            <w:sz w:val="19"/>
+            <w:szCs w:val="19"/>
+            <w:u w:val="single"/>
+          </w:rPr>
+          <w:t xml:space="preserve">github.com/jonasfiers/PICASSO</w:t>
         </w:r>
       </w:hyperlink>
     </w:p>

</xml_diff>

<commit_message>
certifications: 12, adding the ODC Web Developer specialization
Adds Web Developer Specialist (ODC), earned 2026-07-31, taking the total
to 12 — 6 certifications and 6 specializations. Web Developer is now held
on both platforms, so it reads "(O11 and ODC)" like the existing Front-end,
Mobile and Security entries rather than as two separate list items.

Applied on top of the CV synced in 9f95f25; wording is otherwise untouched.
The PDF is regenerated from the docx with LibreOffice, so it is produced by
an amd64 25.2.3 build rather than the aarch64 26.2.4.2 one used before —
text and layout diff clean against the previous PDF apart from these lines.

Co-Authored-By: Claude Opus 5 (1M context) <noreply@anthropic.com>
Claude-Session: https://claude.ai/code/session_0168bRnbTK2SN5oN3bxcj2na
</commit_message>
<xml_diff>
--- a/Jonas_Fiers_CV.docx
+++ b/Jonas_Fiers_CV.docx
@@ -566,7 +566,7 @@
           <w:sz w:val="19"/>
           <w:szCs w:val="19"/>
         </w:rPr>
-        <w:t xml:space="preserve">OutSystems certifications &amp; specializations (11) — Certifications (6): </w:t>
+        <w:t xml:space="preserve">OutSystems certifications &amp; specializations (12) — Certifications (6): </w:t>
       </w:r>
       <w:r>
         <w:rPr>
@@ -591,16 +591,16 @@
           <w:sz w:val="19"/>
           <w:szCs w:val="19"/>
         </w:rPr>
-        <w:t xml:space="preserve">Specializations (5): </w:t>
-      </w:r>
-      <w:r>
-        <w:rPr>
-          <w:rFonts w:ascii="Arial" w:cs="Arial" w:eastAsia="Arial" w:hAnsi="Arial"/>
-          <w:color w:val="1A1A1A"/>
-          <w:sz w:val="19"/>
-          <w:szCs w:val="19"/>
-        </w:rPr>
-        <w:t xml:space="preserve">Architecture, Security, Front-end Developer, Mobile Developer, Web Developer —</w:t>
+        <w:t xml:space="preserve">Specializations (6): </w:t>
+      </w:r>
+      <w:r>
+        <w:rPr>
+          <w:rFonts w:ascii="Arial" w:cs="Arial" w:eastAsia="Arial" w:hAnsi="Arial"/>
+          <w:color w:val="1A1A1A"/>
+          <w:sz w:val="19"/>
+          <w:szCs w:val="19"/>
+        </w:rPr>
+        <w:t xml:space="preserve">Architecture, Security, Front-end Developer, Mobile Developer, Web Developer (O11 and ODC) —</w:t>
       </w:r>
     </w:p>
     <w:p>

</xml_diff>

<commit_message>
certifications: 13, adding the ODC architecture specialization
Architecture is now held on both platforms, so it reads "Architecture
(O11 and ODC)" like Web Developer, Front-end, Mobile and Security. That
takes specializations to 7 and the total to 13; certifications stay at 6.

Note the list now shows five entries for seven credentials — Architecture
and Web Developer each stand for two badges. The counts are stated
explicitly, so this is deliberate rather than a miscount.

Co-Authored-By: Claude Opus 5 (1M context) <noreply@anthropic.com>
Claude-Session: https://claude.ai/code/session_0168bRnbTK2SN5oN3bxcj2na
</commit_message>
<xml_diff>
--- a/Jonas_Fiers_CV.docx
+++ b/Jonas_Fiers_CV.docx
@@ -566,7 +566,7 @@
           <w:sz w:val="19"/>
           <w:szCs w:val="19"/>
         </w:rPr>
-        <w:t xml:space="preserve">OutSystems certifications &amp; specializations (12) — Certifications (6): </w:t>
+        <w:t xml:space="preserve">OutSystems certifications &amp; specializations (13) — Certifications (6): </w:t>
       </w:r>
       <w:r>
         <w:rPr>
@@ -591,16 +591,16 @@
           <w:sz w:val="19"/>
           <w:szCs w:val="19"/>
         </w:rPr>
-        <w:t xml:space="preserve">Specializations (6): </w:t>
-      </w:r>
-      <w:r>
-        <w:rPr>
-          <w:rFonts w:ascii="Arial" w:cs="Arial" w:eastAsia="Arial" w:hAnsi="Arial"/>
-          <w:color w:val="1A1A1A"/>
-          <w:sz w:val="19"/>
-          <w:szCs w:val="19"/>
-        </w:rPr>
-        <w:t xml:space="preserve">Architecture, Security, Front-end Developer, Mobile Developer, Web Developer (O11 and ODC) —</w:t>
+        <w:t xml:space="preserve">Specializations (7): </w:t>
+      </w:r>
+      <w:r>
+        <w:rPr>
+          <w:rFonts w:ascii="Arial" w:cs="Arial" w:eastAsia="Arial" w:hAnsi="Arial"/>
+          <w:color w:val="1A1A1A"/>
+          <w:sz w:val="19"/>
+          <w:szCs w:val="19"/>
+        </w:rPr>
+        <w:t xml:space="preserve">Architecture (O11 and ODC), Security, Front-end Developer, Mobile Developer, Web Developer (O11 and ODC) —</w:t>
       </w:r>
     </w:p>
     <w:p>

</xml_diff>

<commit_message>
certifications: 15, adding ODC Expert Developer and Agentic AI Specialist
Both attained 2026-08-05, per the OutSystems profile:
  - Expert Developer (ODC)      -> certifications 6 -> 7
  - Agentic AI Specialist (ODC) -> specializations 7 -> 8

Keeps the existing aggregated phrasing; Expert Developer picks up the
"(O11 and ODC)" qualifier already used for Architecture and Web Developer.
CV docx/pdf synced with the portfolio page, PDF regenerated on devbox and
still one page. Adds "Agentic AI" to the JSON-LD knowsAbout.

Co-Authored-By: Claude Opus 5 (1M context) <noreply@anthropic.com>
Claude-Session: https://claude.ai/code/session_01BQtZiJWPfWtPBHtXwk7N8m
</commit_message>
<xml_diff>
--- a/Jonas_Fiers_CV.docx
+++ b/Jonas_Fiers_CV.docx
@@ -566,16 +566,16 @@
           <w:sz w:val="19"/>
           <w:szCs w:val="19"/>
         </w:rPr>
-        <w:t xml:space="preserve">OutSystems certifications &amp; specializations (13) — Certifications (6): </w:t>
-      </w:r>
-      <w:r>
-        <w:rPr>
-          <w:rFonts w:ascii="Arial" w:cs="Arial" w:eastAsia="Arial" w:hAnsi="Arial"/>
-          <w:color w:val="1A1A1A"/>
-          <w:sz w:val="19"/>
-          <w:szCs w:val="19"/>
-        </w:rPr>
-        <w:t xml:space="preserve">Expert Developer, Professional Developer (Reactive &amp; Traditional), Associate Developer (ODC, Reactive &amp; Traditional)</w:t>
+        <w:t xml:space="preserve">OutSystems certifications &amp; specializations (15) — Certifications (7): </w:t>
+      </w:r>
+      <w:r>
+        <w:rPr>
+          <w:rFonts w:ascii="Arial" w:cs="Arial" w:eastAsia="Arial" w:hAnsi="Arial"/>
+          <w:color w:val="1A1A1A"/>
+          <w:sz w:val="19"/>
+          <w:szCs w:val="19"/>
+        </w:rPr>
+        <w:t xml:space="preserve">Expert Developer (O11 and ODC), Professional Developer (Reactive &amp; Traditional), Associate Developer (ODC, Reactive &amp; Traditional)</w:t>
       </w:r>
     </w:p>
     <w:p>
@@ -591,16 +591,16 @@
           <w:sz w:val="19"/>
           <w:szCs w:val="19"/>
         </w:rPr>
-        <w:t xml:space="preserve">Specializations (7): </w:t>
-      </w:r>
-      <w:r>
-        <w:rPr>
-          <w:rFonts w:ascii="Arial" w:cs="Arial" w:eastAsia="Arial" w:hAnsi="Arial"/>
-          <w:color w:val="1A1A1A"/>
-          <w:sz w:val="19"/>
-          <w:szCs w:val="19"/>
-        </w:rPr>
-        <w:t xml:space="preserve">Architecture (O11 and ODC), Security, Front-end Developer, Mobile Developer, Web Developer (O11 and ODC) —</w:t>
+        <w:t xml:space="preserve">Specializations (8): </w:t>
+      </w:r>
+      <w:r>
+        <w:rPr>
+          <w:rFonts w:ascii="Arial" w:cs="Arial" w:eastAsia="Arial" w:hAnsi="Arial"/>
+          <w:color w:val="1A1A1A"/>
+          <w:sz w:val="19"/>
+          <w:szCs w:val="19"/>
+        </w:rPr>
+        <w:t xml:space="preserve">Agentic AI (ODC), Architecture (O11 and ODC), Security, Front-end Developer, Mobile Developer, Web Developer (O11 and ODC) —</w:t>
       </w:r>
     </w:p>
     <w:p>

</xml_diff>